<commit_message>
Updated report and added video link
</commit_message>
<xml_diff>
--- a/report/MLoPS-Assignment-May.docx
+++ b/report/MLoPS-Assignment-May.docx
@@ -84,15 +84,7 @@
           <w:b/>
           <w:bCs/>
         </w:rPr>
-        <w:t>2025cs05002</w:t>
-      </w:r>
-      <w:r>
-        <w:rPr>
-          <w:rFonts w:ascii="CiscoSansTT" w:hAnsi="CiscoSansTT" w:cs="CiscoSansTT"/>
-          <w:b/>
-          <w:bCs/>
-        </w:rPr>
-        <w:t xml:space="preserve"> – Kavya Gullipalli</w:t>
+        <w:t>2025cs05002 – Kavya Gullipalli</w:t>
       </w:r>
     </w:p>
     <w:p>
@@ -263,6 +255,42 @@
           <w:rFonts w:ascii="CiscoSansTT" w:hAnsi="CiscoSansTT" w:cs="CiscoSansTT"/>
         </w:rPr>
       </w:pPr>
+      <w:r>
+        <w:rPr>
+          <w:rFonts w:ascii="CiscoSansTT" w:hAnsi="CiscoSansTT" w:cs="CiscoSansTT"/>
+        </w:rPr>
+        <w:t>Video Demonstration Link:</w:t>
+      </w:r>
+    </w:p>
+    <w:p>
+      <w:pPr>
+        <w:rPr>
+          <w:rFonts w:ascii="CiscoSansTT" w:hAnsi="CiscoSansTT" w:cs="CiscoSansTT"/>
+        </w:rPr>
+      </w:pPr>
+      <w:hyperlink r:id="rId9" w:history="1">
+        <w:r>
+          <w:rPr>
+            <w:rStyle w:val="Hyperlink"/>
+            <w:rFonts w:ascii="CiscoSansTT" w:hAnsi="CiscoSansTT" w:cs="CiscoSansTT"/>
+          </w:rPr>
+          <w:t>https://drive.google.com/your-link</w:t>
+        </w:r>
+      </w:hyperlink>
+    </w:p>
+    <w:p>
+      <w:pPr>
+        <w:rPr>
+          <w:rFonts w:ascii="CiscoSansTT" w:hAnsi="CiscoSansTT" w:cs="CiscoSansTT"/>
+        </w:rPr>
+      </w:pPr>
+    </w:p>
+    <w:p>
+      <w:pPr>
+        <w:rPr>
+          <w:rFonts w:ascii="CiscoSansTT" w:hAnsi="CiscoSansTT" w:cs="CiscoSansTT"/>
+        </w:rPr>
+      </w:pPr>
     </w:p>
     <w:p>
       <w:pPr>
@@ -333,7 +361,6 @@
           <w:sz w:val="36"/>
           <w:szCs w:val="36"/>
         </w:rPr>
-        <w:lastRenderedPageBreak/>
         <w:t>Abstract</w:t>
       </w:r>
     </w:p>
@@ -414,7 +441,14 @@
     <w:sdt>
       <w:sdtPr>
         <w:rPr>
-          <w:rFonts w:ascii="CiscoSansTT" w:hAnsi="CiscoSansTT" w:cs="CiscoSansTT"/>
+          <w:rFonts w:ascii="CiscoSansTT" w:eastAsiaTheme="minorHAnsi" w:hAnsi="CiscoSansTT" w:cs="CiscoSansTT"/>
+          <w:b w:val="0"/>
+          <w:bCs w:val="0"/>
+          <w:color w:val="auto"/>
+          <w:kern w:val="2"/>
+          <w:sz w:val="24"/>
+          <w:szCs w:val="24"/>
+          <w14:ligatures w14:val="standardContextual"/>
         </w:rPr>
         <w:id w:val="-952247243"/>
         <w:docPartObj>
@@ -424,13 +458,7 @@
       </w:sdtPr>
       <w:sdtEndPr>
         <w:rPr>
-          <w:rFonts w:eastAsiaTheme="minorHAnsi"/>
           <w:noProof/>
-          <w:color w:val="auto"/>
-          <w:kern w:val="2"/>
-          <w:sz w:val="24"/>
-          <w:szCs w:val="24"/>
-          <w14:ligatures w14:val="standardContextual"/>
         </w:rPr>
       </w:sdtEndPr>
       <w:sdtContent>
@@ -1562,33 +1590,7 @@
           <w:szCs w:val="28"/>
           <w14:ligatures w14:val="none"/>
         </w:rPr>
-        <w:t>List</w:t>
-      </w:r>
-      <w:r>
-        <w:rPr>
-          <w:rFonts w:ascii="CiscoSansTT" w:eastAsiaTheme="majorEastAsia" w:hAnsi="CiscoSansTT" w:cs="CiscoSansTT"/>
-          <w:b/>
-          <w:bCs/>
-          <w:color w:val="0F4761" w:themeColor="accent1" w:themeShade="BF"/>
-          <w:kern w:val="0"/>
-          <w:sz w:val="28"/>
-          <w:szCs w:val="28"/>
-          <w14:ligatures w14:val="none"/>
-        </w:rPr>
-        <w:t xml:space="preserve"> </w:t>
-      </w:r>
-      <w:r>
-        <w:rPr>
-          <w:rFonts w:ascii="CiscoSansTT" w:eastAsiaTheme="majorEastAsia" w:hAnsi="CiscoSansTT" w:cs="CiscoSansTT"/>
-          <w:b/>
-          <w:bCs/>
-          <w:color w:val="0F4761" w:themeColor="accent1" w:themeShade="BF"/>
-          <w:kern w:val="0"/>
-          <w:sz w:val="28"/>
-          <w:szCs w:val="28"/>
-          <w14:ligatures w14:val="none"/>
-        </w:rPr>
-        <w:t>of Figures</w:t>
+        <w:t>List of Figures</w:t>
       </w:r>
     </w:p>
     <w:p>
@@ -3146,7 +3148,7 @@
           <w:noProof/>
         </w:rPr>
         <w:drawing>
-          <wp:inline distT="0" distB="0" distL="0" distR="0" wp14:anchorId="1124AE6D" wp14:editId="53EF4B8D">
+          <wp:inline distT="0" distB="0" distL="0" distR="0" wp14:anchorId="1124AE6D" wp14:editId="7F6C3A2E">
             <wp:extent cx="6743192" cy="1859972"/>
             <wp:effectExtent l="0" t="0" r="635" b="0"/>
             <wp:docPr id="932212248" name="Picture 20"/>
@@ -3161,7 +3163,7 @@
                     <pic:cNvPicPr/>
                   </pic:nvPicPr>
                   <pic:blipFill>
-                    <a:blip r:embed="rId9" cstate="print">
+                    <a:blip r:embed="rId10" cstate="print">
                       <a:extLst>
                         <a:ext uri="{28A0092B-C50C-407E-A947-70E740481C1C}">
                           <a14:useLocalDpi xmlns:a14="http://schemas.microsoft.com/office/drawing/2010/main" val="0"/>
@@ -3404,7 +3406,7 @@
                     <pic:cNvPicPr/>
                   </pic:nvPicPr>
                   <pic:blipFill>
-                    <a:blip r:embed="rId10">
+                    <a:blip r:embed="rId11">
                       <a:extLst>
                         <a:ext uri="{28A0092B-C50C-407E-A947-70E740481C1C}">
                           <a14:useLocalDpi xmlns:a14="http://schemas.microsoft.com/office/drawing/2010/main" val="0"/>
@@ -3541,7 +3543,7 @@
                     <pic:cNvPicPr/>
                   </pic:nvPicPr>
                   <pic:blipFill>
-                    <a:blip r:embed="rId11">
+                    <a:blip r:embed="rId12">
                       <a:extLst>
                         <a:ext uri="{28A0092B-C50C-407E-A947-70E740481C1C}">
                           <a14:useLocalDpi xmlns:a14="http://schemas.microsoft.com/office/drawing/2010/main" val="0"/>
@@ -3662,7 +3664,7 @@
           <w:noProof/>
         </w:rPr>
         <w:drawing>
-          <wp:inline distT="0" distB="0" distL="0" distR="0" wp14:anchorId="40AE3FF2" wp14:editId="3BE4AFA5">
+          <wp:inline distT="0" distB="0" distL="0" distR="0" wp14:anchorId="40AE3FF2" wp14:editId="22ED29E0">
             <wp:extent cx="4873336" cy="3891380"/>
             <wp:effectExtent l="0" t="0" r="3810" b="0"/>
             <wp:docPr id="1362909842" name="Picture 5"/>
@@ -3677,7 +3679,7 @@
                     <pic:cNvPicPr/>
                   </pic:nvPicPr>
                   <pic:blipFill>
-                    <a:blip r:embed="rId12" cstate="print">
+                    <a:blip r:embed="rId13" cstate="print">
                       <a:extLst>
                         <a:ext uri="{28A0092B-C50C-407E-A947-70E740481C1C}">
                           <a14:useLocalDpi xmlns:a14="http://schemas.microsoft.com/office/drawing/2010/main" val="0"/>
@@ -4125,7 +4127,7 @@
                     <pic:cNvPicPr/>
                   </pic:nvPicPr>
                   <pic:blipFill>
-                    <a:blip r:embed="rId13" cstate="print">
+                    <a:blip r:embed="rId14" cstate="print">
                       <a:extLst>
                         <a:ext uri="{28A0092B-C50C-407E-A947-70E740481C1C}">
                           <a14:useLocalDpi xmlns:a14="http://schemas.microsoft.com/office/drawing/2010/main" val="0"/>
@@ -4261,7 +4263,7 @@
                     <pic:cNvPicPr/>
                   </pic:nvPicPr>
                   <pic:blipFill>
-                    <a:blip r:embed="rId14" cstate="print">
+                    <a:blip r:embed="rId15" cstate="print">
                       <a:extLst>
                         <a:ext uri="{28A0092B-C50C-407E-A947-70E740481C1C}">
                           <a14:useLocalDpi xmlns:a14="http://schemas.microsoft.com/office/drawing/2010/main" val="0"/>
@@ -4415,7 +4417,7 @@
                     <pic:cNvPicPr/>
                   </pic:nvPicPr>
                   <pic:blipFill>
-                    <a:blip r:embed="rId15">
+                    <a:blip r:embed="rId16">
                       <a:extLst>
                         <a:ext uri="{28A0092B-C50C-407E-A947-70E740481C1C}">
                           <a14:useLocalDpi xmlns:a14="http://schemas.microsoft.com/office/drawing/2010/main" val="0"/>
@@ -4777,7 +4779,7 @@
                     <pic:cNvPicPr/>
                   </pic:nvPicPr>
                   <pic:blipFill>
-                    <a:blip r:embed="rId16" cstate="print">
+                    <a:blip r:embed="rId17" cstate="print">
                       <a:extLst>
                         <a:ext uri="{28A0092B-C50C-407E-A947-70E740481C1C}">
                           <a14:useLocalDpi xmlns:a14="http://schemas.microsoft.com/office/drawing/2010/main" val="0"/>
@@ -5444,7 +5446,7 @@
                     <pic:cNvPicPr/>
                   </pic:nvPicPr>
                   <pic:blipFill>
-                    <a:blip r:embed="rId17" cstate="print">
+                    <a:blip r:embed="rId18" cstate="print">
                       <a:extLst>
                         <a:ext uri="{28A0092B-C50C-407E-A947-70E740481C1C}">
                           <a14:useLocalDpi xmlns:a14="http://schemas.microsoft.com/office/drawing/2010/main" val="0"/>
@@ -5600,7 +5602,7 @@
                     <pic:cNvPicPr/>
                   </pic:nvPicPr>
                   <pic:blipFill>
-                    <a:blip r:embed="rId18" cstate="print">
+                    <a:blip r:embed="rId19" cstate="print">
                       <a:extLst>
                         <a:ext uri="{28A0092B-C50C-407E-A947-70E740481C1C}">
                           <a14:useLocalDpi xmlns:a14="http://schemas.microsoft.com/office/drawing/2010/main" val="0"/>
@@ -6070,7 +6072,7 @@
                     <pic:cNvPicPr/>
                   </pic:nvPicPr>
                   <pic:blipFill>
-                    <a:blip r:embed="rId19" cstate="print">
+                    <a:blip r:embed="rId20" cstate="print">
                       <a:extLst>
                         <a:ext uri="{28A0092B-C50C-407E-A947-70E740481C1C}">
                           <a14:useLocalDpi xmlns:a14="http://schemas.microsoft.com/office/drawing/2010/main" val="0"/>
@@ -6203,7 +6205,7 @@
           <w:noProof/>
         </w:rPr>
         <w:drawing>
-          <wp:inline distT="0" distB="0" distL="0" distR="0" wp14:anchorId="59A4201C" wp14:editId="535A4999">
+          <wp:inline distT="0" distB="0" distL="0" distR="0" wp14:anchorId="59A4201C" wp14:editId="085E40EB">
             <wp:extent cx="5943600" cy="535305"/>
             <wp:effectExtent l="0" t="0" r="0" b="0"/>
             <wp:docPr id="866576301" name="Picture 13"/>
@@ -6218,7 +6220,7 @@
                     <pic:cNvPicPr/>
                   </pic:nvPicPr>
                   <pic:blipFill>
-                    <a:blip r:embed="rId20" cstate="print">
+                    <a:blip r:embed="rId21" cstate="print">
                       <a:extLst>
                         <a:ext uri="{28A0092B-C50C-407E-A947-70E740481C1C}">
                           <a14:useLocalDpi xmlns:a14="http://schemas.microsoft.com/office/drawing/2010/main" val="0"/>
@@ -6375,7 +6377,7 @@
                     <pic:cNvPicPr/>
                   </pic:nvPicPr>
                   <pic:blipFill>
-                    <a:blip r:embed="rId21">
+                    <a:blip r:embed="rId22">
                       <a:extLst>
                         <a:ext uri="{28A0092B-C50C-407E-A947-70E740481C1C}">
                           <a14:useLocalDpi xmlns:a14="http://schemas.microsoft.com/office/drawing/2010/main" val="0"/>
@@ -6730,7 +6732,7 @@
                     <pic:cNvPicPr/>
                   </pic:nvPicPr>
                   <pic:blipFill>
-                    <a:blip r:embed="rId22" cstate="print">
+                    <a:blip r:embed="rId23" cstate="print">
                       <a:extLst>
                         <a:ext uri="{28A0092B-C50C-407E-A947-70E740481C1C}">
                           <a14:useLocalDpi xmlns:a14="http://schemas.microsoft.com/office/drawing/2010/main" val="0"/>
@@ -6896,7 +6898,7 @@
                     <pic:cNvPicPr/>
                   </pic:nvPicPr>
                   <pic:blipFill>
-                    <a:blip r:embed="rId23" cstate="print">
+                    <a:blip r:embed="rId24" cstate="print">
                       <a:extLst>
                         <a:ext uri="{28A0092B-C50C-407E-A947-70E740481C1C}">
                           <a14:useLocalDpi xmlns:a14="http://schemas.microsoft.com/office/drawing/2010/main" val="0"/>
@@ -7526,7 +7528,7 @@
           <w:noProof/>
         </w:rPr>
         <w:drawing>
-          <wp:inline distT="0" distB="0" distL="0" distR="0" wp14:anchorId="1EB31632" wp14:editId="0AF25618">
+          <wp:inline distT="0" distB="0" distL="0" distR="0" wp14:anchorId="1EB31632" wp14:editId="555065CD">
             <wp:extent cx="5943600" cy="553085"/>
             <wp:effectExtent l="0" t="0" r="0" b="5715"/>
             <wp:docPr id="532608308" name="Picture 17"/>
@@ -7541,7 +7543,7 @@
                     <pic:cNvPicPr/>
                   </pic:nvPicPr>
                   <pic:blipFill>
-                    <a:blip r:embed="rId24" cstate="print">
+                    <a:blip r:embed="rId25" cstate="print">
                       <a:extLst>
                         <a:ext uri="{28A0092B-C50C-407E-A947-70E740481C1C}">
                           <a14:useLocalDpi xmlns:a14="http://schemas.microsoft.com/office/drawing/2010/main" val="0"/>
@@ -7683,7 +7685,7 @@
           <w:noProof/>
         </w:rPr>
         <w:drawing>
-          <wp:inline distT="0" distB="0" distL="0" distR="0" wp14:anchorId="7A409F00" wp14:editId="41CDB054">
+          <wp:inline distT="0" distB="0" distL="0" distR="0" wp14:anchorId="7A409F00" wp14:editId="6B4BC84F">
             <wp:extent cx="5943600" cy="567690"/>
             <wp:effectExtent l="0" t="0" r="0" b="3810"/>
             <wp:docPr id="1094301440" name="Picture 18"/>
@@ -7698,7 +7700,7 @@
                     <pic:cNvPicPr/>
                   </pic:nvPicPr>
                   <pic:blipFill>
-                    <a:blip r:embed="rId25" cstate="print">
+                    <a:blip r:embed="rId26" cstate="print">
                       <a:extLst>
                         <a:ext uri="{28A0092B-C50C-407E-A947-70E740481C1C}">
                           <a14:useLocalDpi xmlns:a14="http://schemas.microsoft.com/office/drawing/2010/main" val="0"/>
@@ -7840,7 +7842,7 @@
           <w:noProof/>
         </w:rPr>
         <w:drawing>
-          <wp:inline distT="0" distB="0" distL="0" distR="0" wp14:anchorId="6A726D03" wp14:editId="41FDD47E">
+          <wp:inline distT="0" distB="0" distL="0" distR="0" wp14:anchorId="6A726D03" wp14:editId="686AFBD3">
             <wp:extent cx="5943600" cy="760095"/>
             <wp:effectExtent l="0" t="0" r="0" b="1905"/>
             <wp:docPr id="947725113" name="Picture 19"/>
@@ -7855,7 +7857,7 @@
                     <pic:cNvPicPr/>
                   </pic:nvPicPr>
                   <pic:blipFill>
-                    <a:blip r:embed="rId26" cstate="print">
+                    <a:blip r:embed="rId27" cstate="print">
                       <a:extLst>
                         <a:ext uri="{28A0092B-C50C-407E-A947-70E740481C1C}">
                           <a14:useLocalDpi xmlns:a14="http://schemas.microsoft.com/office/drawing/2010/main" val="0"/>
@@ -8283,7 +8285,7 @@
           <w:rFonts w:ascii="CiscoSansTT" w:hAnsi="CiscoSansTT" w:cs="CiscoSansTT"/>
         </w:rPr>
       </w:pPr>
-      <w:hyperlink r:id="rId27" w:history="1">
+      <w:hyperlink r:id="rId28" w:history="1">
         <w:r>
           <w:rPr>
             <w:rStyle w:val="Hyperlink"/>
@@ -8304,7 +8306,7 @@
           <w:rFonts w:ascii="CiscoSansTT" w:hAnsi="CiscoSansTT" w:cs="CiscoSansTT"/>
         </w:rPr>
       </w:pPr>
-      <w:hyperlink r:id="rId28" w:history="1">
+      <w:hyperlink r:id="rId29" w:history="1">
         <w:r>
           <w:rPr>
             <w:rStyle w:val="Hyperlink"/>
@@ -8325,7 +8327,7 @@
           <w:rFonts w:ascii="CiscoSansTT" w:hAnsi="CiscoSansTT" w:cs="CiscoSansTT"/>
         </w:rPr>
       </w:pPr>
-      <w:hyperlink r:id="rId29" w:history="1">
+      <w:hyperlink r:id="rId30" w:history="1">
         <w:r>
           <w:rPr>
             <w:rStyle w:val="Hyperlink"/>
@@ -8346,7 +8348,7 @@
           <w:rFonts w:ascii="CiscoSansTT" w:hAnsi="CiscoSansTT" w:cs="CiscoSansTT"/>
         </w:rPr>
       </w:pPr>
-      <w:hyperlink r:id="rId30" w:history="1">
+      <w:hyperlink r:id="rId31" w:history="1">
         <w:r>
           <w:rPr>
             <w:rStyle w:val="Hyperlink"/>
@@ -8367,7 +8369,7 @@
           <w:rFonts w:ascii="CiscoSansTT" w:hAnsi="CiscoSansTT" w:cs="CiscoSansTT"/>
         </w:rPr>
       </w:pPr>
-      <w:hyperlink r:id="rId31" w:history="1">
+      <w:hyperlink r:id="rId32" w:history="1">
         <w:r>
           <w:rPr>
             <w:rStyle w:val="Hyperlink"/>
@@ -8403,8 +8405,8 @@
       </w:pPr>
     </w:p>
     <w:sectPr>
-      <w:footerReference w:type="even" r:id="rId32"/>
-      <w:footerReference w:type="default" r:id="rId33"/>
+      <w:footerReference w:type="even" r:id="rId33"/>
+      <w:footerReference w:type="default" r:id="rId34"/>
       <w:pgSz w:w="12240" w:h="15840"/>
       <w:pgMar w:top="1440" w:right="1440" w:bottom="1440" w:left="1440" w:header="720" w:footer="720" w:gutter="0"/>
       <w:cols w:space="720"/>

</xml_diff>

<commit_message>
Added video demonstration link
</commit_message>
<xml_diff>
--- a/report/MLoPS-Assignment-May.docx
+++ b/report/MLoPS-Assignment-May.docx
@@ -265,16 +265,22 @@
     <w:p>
       <w:pPr>
         <w:rPr>
-          <w:rFonts w:ascii="CiscoSansTT" w:hAnsi="CiscoSansTT" w:cs="CiscoSansTT"/>
+          <w:rFonts w:ascii="AppleSystemUIFont" w:hAnsi="AppleSystemUIFont" w:cs="AppleSystemUIFont"/>
+          <w:kern w:val="0"/>
+          <w:sz w:val="26"/>
+          <w:szCs w:val="26"/>
         </w:rPr>
       </w:pPr>
       <w:hyperlink r:id="rId9" w:history="1">
         <w:r>
           <w:rPr>
             <w:rStyle w:val="Hyperlink"/>
-            <w:rFonts w:ascii="CiscoSansTT" w:hAnsi="CiscoSansTT" w:cs="CiscoSansTT"/>
-          </w:rPr>
-          <w:t>https://drive.google.com/your-link</w:t>
+            <w:rFonts w:ascii="AppleSystemUIFont" w:hAnsi="AppleSystemUIFont" w:cs="AppleSystemUIFont"/>
+            <w:kern w:val="0"/>
+            <w:sz w:val="26"/>
+            <w:szCs w:val="26"/>
+          </w:rPr>
+          <w:t>https://drive.google.com/file/d/1FYVNr7B0Scrmx6E9T4of45TbcZhDLWdT/view?usp=sharing</w:t>
         </w:r>
       </w:hyperlink>
     </w:p>
@@ -3148,7 +3154,7 @@
           <w:noProof/>
         </w:rPr>
         <w:drawing>
-          <wp:inline distT="0" distB="0" distL="0" distR="0" wp14:anchorId="1124AE6D" wp14:editId="7F6C3A2E">
+          <wp:inline distT="0" distB="0" distL="0" distR="0" wp14:anchorId="1124AE6D" wp14:editId="5001257A">
             <wp:extent cx="6743192" cy="1859972"/>
             <wp:effectExtent l="0" t="0" r="635" b="0"/>
             <wp:docPr id="932212248" name="Picture 20"/>
@@ -3664,7 +3670,7 @@
           <w:noProof/>
         </w:rPr>
         <w:drawing>
-          <wp:inline distT="0" distB="0" distL="0" distR="0" wp14:anchorId="40AE3FF2" wp14:editId="22ED29E0">
+          <wp:inline distT="0" distB="0" distL="0" distR="0" wp14:anchorId="40AE3FF2" wp14:editId="0231EA96">
             <wp:extent cx="4873336" cy="3891380"/>
             <wp:effectExtent l="0" t="0" r="3810" b="0"/>
             <wp:docPr id="1362909842" name="Picture 5"/>
@@ -6205,7 +6211,7 @@
           <w:noProof/>
         </w:rPr>
         <w:drawing>
-          <wp:inline distT="0" distB="0" distL="0" distR="0" wp14:anchorId="59A4201C" wp14:editId="085E40EB">
+          <wp:inline distT="0" distB="0" distL="0" distR="0" wp14:anchorId="59A4201C" wp14:editId="44D6DEE6">
             <wp:extent cx="5943600" cy="535305"/>
             <wp:effectExtent l="0" t="0" r="0" b="0"/>
             <wp:docPr id="866576301" name="Picture 13"/>
@@ -7528,7 +7534,7 @@
           <w:noProof/>
         </w:rPr>
         <w:drawing>
-          <wp:inline distT="0" distB="0" distL="0" distR="0" wp14:anchorId="1EB31632" wp14:editId="555065CD">
+          <wp:inline distT="0" distB="0" distL="0" distR="0" wp14:anchorId="1EB31632" wp14:editId="2FBB707B">
             <wp:extent cx="5943600" cy="553085"/>
             <wp:effectExtent l="0" t="0" r="0" b="5715"/>
             <wp:docPr id="532608308" name="Picture 17"/>
@@ -7685,7 +7691,7 @@
           <w:noProof/>
         </w:rPr>
         <w:drawing>
-          <wp:inline distT="0" distB="0" distL="0" distR="0" wp14:anchorId="7A409F00" wp14:editId="6B4BC84F">
+          <wp:inline distT="0" distB="0" distL="0" distR="0" wp14:anchorId="7A409F00" wp14:editId="14197573">
             <wp:extent cx="5943600" cy="567690"/>
             <wp:effectExtent l="0" t="0" r="0" b="3810"/>
             <wp:docPr id="1094301440" name="Picture 18"/>
@@ -7842,7 +7848,7 @@
           <w:noProof/>
         </w:rPr>
         <w:drawing>
-          <wp:inline distT="0" distB="0" distL="0" distR="0" wp14:anchorId="6A726D03" wp14:editId="686AFBD3">
+          <wp:inline distT="0" distB="0" distL="0" distR="0" wp14:anchorId="6A726D03" wp14:editId="21FA22E5">
             <wp:extent cx="5943600" cy="760095"/>
             <wp:effectExtent l="0" t="0" r="0" b="1905"/>
             <wp:docPr id="947725113" name="Picture 19"/>

</xml_diff>